<commit_message>
[WORK] Rinominato analisi_contesto e Banner
</commit_message>
<xml_diff>
--- a/data/tbl/tab_reddito.docx
+++ b/data/tbl/tab_reddito.docx
@@ -23,7 +23,6 @@
           <w:trHeight w:val="390" w:hRule="auto"/>
           <w:tblHeader/>
         </w:trPr>
-        header1
         <w:tc>
           <w:tcPr>
             <w:gridSpan w:val="4"/>
@@ -44,6 +43,7 @@
           </w:tcPr>
           <w:p>
             <w:pPr>
+              <w:pStyle w:val="Normal"/>
               <w:jc w:val="center"/>
               <w:pBdr>
                 <w:bottom w:val="none" w:sz="0" w:space="0" w:color="000000"/>
@@ -86,7 +86,6 @@
           <w:trHeight w:val="286" w:hRule="auto"/>
           <w:tblHeader/>
         </w:trPr>
-        header2
         <w:tc>
           <w:tcPr>
             <w:tcBorders>
@@ -106,6 +105,7 @@
           </w:tcPr>
           <w:p>
             <w:pPr>
+              <w:pStyle w:val="Normal"/>
               <w:jc w:val="left"/>
               <w:pBdr>
                 <w:bottom w:val="none" w:sz="0" w:space="0" w:color="000000"/>
@@ -160,6 +160,7 @@
           </w:tcPr>
           <w:p>
             <w:pPr>
+              <w:pStyle w:val="Normal"/>
               <w:jc w:val="right"/>
               <w:pBdr>
                 <w:bottom w:val="none" w:sz="0" w:space="0" w:color="000000"/>
@@ -214,6 +215,7 @@
           </w:tcPr>
           <w:p>
             <w:pPr>
+              <w:pStyle w:val="Normal"/>
               <w:jc w:val="right"/>
               <w:pBdr>
                 <w:bottom w:val="none" w:sz="0" w:space="0" w:color="000000"/>
@@ -268,6 +270,7 @@
           </w:tcPr>
           <w:p>
             <w:pPr>
+              <w:pStyle w:val="Normal"/>
               <w:jc w:val="right"/>
               <w:pBdr>
                 <w:bottom w:val="none" w:sz="0" w:space="0" w:color="000000"/>
@@ -309,7 +312,6 @@
           <w:cantSplit/>
           <w:trHeight w:val="289" w:hRule="auto"/>
         </w:trPr>
-        body1
         <w:tc>
           <w:tcPr>
             <w:tcBorders>
@@ -329,6 +331,7 @@
           </w:tcPr>
           <w:p>
             <w:pPr>
+              <w:pStyle w:val="Normal"/>
               <w:jc w:val="left"/>
               <w:pBdr>
                 <w:bottom w:val="none" w:sz="0" w:space="0" w:color="000000"/>
@@ -383,6 +386,7 @@
           </w:tcPr>
           <w:p>
             <w:pPr>
+              <w:pStyle w:val="Normal"/>
               <w:jc w:val="right"/>
               <w:pBdr>
                 <w:bottom w:val="none" w:sz="0" w:space="0" w:color="000000"/>
@@ -437,6 +441,7 @@
           </w:tcPr>
           <w:p>
             <w:pPr>
+              <w:pStyle w:val="Normal"/>
               <w:jc w:val="right"/>
               <w:pBdr>
                 <w:bottom w:val="none" w:sz="0" w:space="0" w:color="000000"/>
@@ -491,6 +496,7 @@
           </w:tcPr>
           <w:p>
             <w:pPr>
+              <w:pStyle w:val="Normal"/>
               <w:jc w:val="right"/>
               <w:pBdr>
                 <w:bottom w:val="none" w:sz="0" w:space="0" w:color="000000"/>
@@ -532,7 +538,6 @@
           <w:cantSplit/>
           <w:trHeight w:val="289" w:hRule="auto"/>
         </w:trPr>
-        body2
         <w:tc>
           <w:tcPr>
             <w:tcBorders>
@@ -552,6 +557,7 @@
           </w:tcPr>
           <w:p>
             <w:pPr>
+              <w:pStyle w:val="Normal"/>
               <w:jc w:val="left"/>
               <w:pBdr>
                 <w:bottom w:val="none" w:sz="0" w:space="0" w:color="000000"/>
@@ -606,6 +612,7 @@
           </w:tcPr>
           <w:p>
             <w:pPr>
+              <w:pStyle w:val="Normal"/>
               <w:jc w:val="right"/>
               <w:pBdr>
                 <w:bottom w:val="none" w:sz="0" w:space="0" w:color="000000"/>
@@ -660,6 +667,7 @@
           </w:tcPr>
           <w:p>
             <w:pPr>
+              <w:pStyle w:val="Normal"/>
               <w:jc w:val="right"/>
               <w:pBdr>
                 <w:bottom w:val="none" w:sz="0" w:space="0" w:color="000000"/>
@@ -714,6 +722,7 @@
           </w:tcPr>
           <w:p>
             <w:pPr>
+              <w:pStyle w:val="Normal"/>
               <w:jc w:val="right"/>
               <w:pBdr>
                 <w:bottom w:val="none" w:sz="0" w:space="0" w:color="000000"/>
@@ -755,7 +764,6 @@
           <w:cantSplit/>
           <w:trHeight w:val="289" w:hRule="auto"/>
         </w:trPr>
-        body3
         <w:tc>
           <w:tcPr>
             <w:tcBorders>
@@ -775,6 +783,7 @@
           </w:tcPr>
           <w:p>
             <w:pPr>
+              <w:pStyle w:val="Normal"/>
               <w:jc w:val="left"/>
               <w:pBdr>
                 <w:bottom w:val="none" w:sz="0" w:space="0" w:color="000000"/>
@@ -829,6 +838,7 @@
           </w:tcPr>
           <w:p>
             <w:pPr>
+              <w:pStyle w:val="Normal"/>
               <w:jc w:val="right"/>
               <w:pBdr>
                 <w:bottom w:val="none" w:sz="0" w:space="0" w:color="000000"/>
@@ -883,6 +893,7 @@
           </w:tcPr>
           <w:p>
             <w:pPr>
+              <w:pStyle w:val="Normal"/>
               <w:jc w:val="right"/>
               <w:pBdr>
                 <w:bottom w:val="none" w:sz="0" w:space="0" w:color="000000"/>
@@ -937,6 +948,7 @@
           </w:tcPr>
           <w:p>
             <w:pPr>
+              <w:pStyle w:val="Normal"/>
               <w:jc w:val="right"/>
               <w:pBdr>
                 <w:bottom w:val="none" w:sz="0" w:space="0" w:color="000000"/>
@@ -978,7 +990,6 @@
           <w:cantSplit/>
           <w:trHeight w:val="337" w:hRule="auto"/>
         </w:trPr>
-        body4
         <w:tc>
           <w:tcPr>
             <w:tcBorders>
@@ -998,6 +1009,7 @@
           </w:tcPr>
           <w:p>
             <w:pPr>
+              <w:pStyle w:val="Normal"/>
               <w:jc w:val="left"/>
               <w:pBdr>
                 <w:bottom w:val="none" w:sz="0" w:space="0" w:color="000000"/>
@@ -1052,6 +1064,7 @@
           </w:tcPr>
           <w:p>
             <w:pPr>
+              <w:pStyle w:val="Normal"/>
               <w:jc w:val="right"/>
               <w:pBdr>
                 <w:bottom w:val="none" w:sz="0" w:space="0" w:color="000000"/>
@@ -1106,6 +1119,7 @@
           </w:tcPr>
           <w:p>
             <w:pPr>
+              <w:pStyle w:val="Normal"/>
               <w:jc w:val="right"/>
               <w:pBdr>
                 <w:bottom w:val="none" w:sz="0" w:space="0" w:color="000000"/>
@@ -1160,6 +1174,7 @@
           </w:tcPr>
           <w:p>
             <w:pPr>
+              <w:pStyle w:val="Normal"/>
               <w:jc w:val="right"/>
               <w:pBdr>
                 <w:bottom w:val="none" w:sz="0" w:space="0" w:color="000000"/>
@@ -1201,7 +1216,6 @@
           <w:cantSplit/>
           <w:trHeight w:val="282" w:hRule="auto"/>
         </w:trPr>
-        body5
         <w:tc>
           <w:tcPr>
             <w:tcBorders>
@@ -1221,6 +1235,7 @@
           </w:tcPr>
           <w:p>
             <w:pPr>
+              <w:pStyle w:val="Normal"/>
               <w:jc w:val="left"/>
               <w:pBdr>
                 <w:bottom w:val="none" w:sz="0" w:space="0" w:color="000000"/>
@@ -1275,6 +1290,7 @@
           </w:tcPr>
           <w:p>
             <w:pPr>
+              <w:pStyle w:val="Normal"/>
               <w:jc w:val="right"/>
               <w:pBdr>
                 <w:bottom w:val="none" w:sz="0" w:space="0" w:color="000000"/>
@@ -1329,6 +1345,7 @@
           </w:tcPr>
           <w:p>
             <w:pPr>
+              <w:pStyle w:val="Normal"/>
               <w:jc w:val="right"/>
               <w:pBdr>
                 <w:bottom w:val="none" w:sz="0" w:space="0" w:color="000000"/>
@@ -1383,6 +1400,7 @@
           </w:tcPr>
           <w:p>
             <w:pPr>
+              <w:pStyle w:val="Normal"/>
               <w:jc w:val="right"/>
               <w:pBdr>
                 <w:bottom w:val="none" w:sz="0" w:space="0" w:color="000000"/>
@@ -1424,7 +1442,6 @@
           <w:cantSplit/>
           <w:trHeight w:val="282" w:hRule="auto"/>
         </w:trPr>
-        body6
         <w:tc>
           <w:tcPr>
             <w:tcBorders>
@@ -1444,6 +1461,7 @@
           </w:tcPr>
           <w:p>
             <w:pPr>
+              <w:pStyle w:val="Normal"/>
               <w:jc w:val="left"/>
               <w:pBdr>
                 <w:bottom w:val="none" w:sz="0" w:space="0" w:color="000000"/>
@@ -1498,6 +1516,7 @@
           </w:tcPr>
           <w:p>
             <w:pPr>
+              <w:pStyle w:val="Normal"/>
               <w:jc w:val="right"/>
               <w:pBdr>
                 <w:bottom w:val="none" w:sz="0" w:space="0" w:color="000000"/>
@@ -1552,6 +1571,7 @@
           </w:tcPr>
           <w:p>
             <w:pPr>
+              <w:pStyle w:val="Normal"/>
               <w:jc w:val="right"/>
               <w:pBdr>
                 <w:bottom w:val="none" w:sz="0" w:space="0" w:color="000000"/>
@@ -1606,6 +1626,7 @@
           </w:tcPr>
           <w:p>
             <w:pPr>
+              <w:pStyle w:val="Normal"/>
               <w:jc w:val="right"/>
               <w:pBdr>
                 <w:bottom w:val="none" w:sz="0" w:space="0" w:color="000000"/>
@@ -1647,7 +1668,6 @@
           <w:cantSplit/>
           <w:trHeight w:val="289" w:hRule="auto"/>
         </w:trPr>
-        body7
         <w:tc>
           <w:tcPr>
             <w:tcBorders>
@@ -1667,6 +1687,7 @@
           </w:tcPr>
           <w:p>
             <w:pPr>
+              <w:pStyle w:val="Normal"/>
               <w:jc w:val="left"/>
               <w:pBdr>
                 <w:bottom w:val="none" w:sz="0" w:space="0" w:color="000000"/>
@@ -1721,6 +1742,7 @@
           </w:tcPr>
           <w:p>
             <w:pPr>
+              <w:pStyle w:val="Normal"/>
               <w:jc w:val="right"/>
               <w:pBdr>
                 <w:bottom w:val="none" w:sz="0" w:space="0" w:color="000000"/>
@@ -1775,6 +1797,7 @@
           </w:tcPr>
           <w:p>
             <w:pPr>
+              <w:pStyle w:val="Normal"/>
               <w:jc w:val="right"/>
               <w:pBdr>
                 <w:bottom w:val="none" w:sz="0" w:space="0" w:color="000000"/>
@@ -1829,6 +1852,7 @@
           </w:tcPr>
           <w:p>
             <w:pPr>
+              <w:pStyle w:val="Normal"/>
               <w:jc w:val="right"/>
               <w:pBdr>
                 <w:bottom w:val="none" w:sz="0" w:space="0" w:color="000000"/>
@@ -1870,7 +1894,6 @@
           <w:cantSplit/>
           <w:trHeight w:val="289" w:hRule="auto"/>
         </w:trPr>
-        body8
         <w:tc>
           <w:tcPr>
             <w:tcBorders>
@@ -1890,6 +1913,7 @@
           </w:tcPr>
           <w:p>
             <w:pPr>
+              <w:pStyle w:val="Normal"/>
               <w:jc w:val="left"/>
               <w:pBdr>
                 <w:bottom w:val="none" w:sz="0" w:space="0" w:color="000000"/>
@@ -1944,6 +1968,7 @@
           </w:tcPr>
           <w:p>
             <w:pPr>
+              <w:pStyle w:val="Normal"/>
               <w:jc w:val="right"/>
               <w:pBdr>
                 <w:bottom w:val="none" w:sz="0" w:space="0" w:color="000000"/>
@@ -1998,6 +2023,7 @@
           </w:tcPr>
           <w:p>
             <w:pPr>
+              <w:pStyle w:val="Normal"/>
               <w:jc w:val="right"/>
               <w:pBdr>
                 <w:bottom w:val="none" w:sz="0" w:space="0" w:color="000000"/>
@@ -2052,6 +2078,7 @@
           </w:tcPr>
           <w:p>
             <w:pPr>
+              <w:pStyle w:val="Normal"/>
               <w:jc w:val="right"/>
               <w:pBdr>
                 <w:bottom w:val="none" w:sz="0" w:space="0" w:color="000000"/>
@@ -2093,7 +2120,6 @@
           <w:cantSplit/>
           <w:trHeight w:val="360" w:hRule="auto"/>
         </w:trPr>
-        footer1
         <w:tc>
           <w:tcPr>
             <w:gridSpan w:val="4"/>
@@ -2114,6 +2140,7 @@
           </w:tcPr>
           <w:p>
             <w:pPr>
+              <w:pStyle w:val="Normal"/>
               <w:jc w:val="left"/>
               <w:pBdr>
                 <w:bottom w:val="none" w:sz="0" w:space="0" w:color="000000"/>

</xml_diff>